<commit_message>
Update documentation and templates for rich text, image, and equation support
Update various documentation files and templates to reflect new support for rich text, images, and equations in bulk uploads.

Replit-Commit-Author: Agent
Replit-Commit-Session-Id: 746a8cf9-eee5-4aa3-b53e-95853956a157
Replit-Commit-Checkpoint-Type: full_checkpoint
Replit-Commit-Event-Id: 4c2f2328-8add-4e50-87bf-c1942c27f397
Replit-Commit-Screenshot-Url: https://storage.googleapis.com/screenshot-production-us-central1/999277e6-b640-4bf4-8437-9ea2b127d433/746a8cf9-eee5-4aa3-b53e-95853956a157/qYZt2A5
</commit_message>
<xml_diff>
--- a/public/downloads/saphala_group_question_template_UPDATED.docx
+++ b/public/downloads/saphala_group_question_template_UPDATED.docx
@@ -24,7 +24,7 @@
         <w:rPr>
           <w:color w:val="111827"/>
         </w:rPr>
-        <w:t xml:space="preserve">Version 2.0  ·  March 2026  ·  Supports images, screenshots, and equations in passage and child questions</w:t>
+        <w:t xml:space="preserve">Version 3.0  ·  March 2026  ·  Rich Text + Images + Screenshots + Equations in passage and children</w:t>
       </w:r>
     </w:p>
     <w:p>
@@ -89,7 +89,7 @@
         <w:rPr>
           <w:color w:val="111827"/>
         </w:rPr>
-        <w:t xml:space="preserve">The shared paragraph/set follows after PASSAGE:.</w:t>
+        <w:t xml:space="preserve">The shared paragraph/passage follows PASSAGE:.</w:t>
       </w:r>
     </w:p>
     <w:p>
@@ -105,7 +105,7 @@
         <w:rPr>
           <w:color w:val="111827"/>
         </w:rPr>
-        <w:t xml:space="preserve">Passage Image: (optional) — screenshot or chart shown above all child questions.</w:t>
+        <w:t xml:space="preserve">PASSAGE may contain rich text (HTML), an image/screenshot, and/or an equation.</w:t>
       </w:r>
     </w:p>
     <w:p>
@@ -121,7 +121,7 @@
         <w:rPr>
           <w:color w:val="111827"/>
         </w:rPr>
-        <w:t xml:space="preserve">Passage Equation: (optional) — math expression relevant to the entire set.</w:t>
+        <w:t xml:space="preserve">CATEGORY / SUBJECT / TOPIC set once at group level and inherited by all children.</w:t>
       </w:r>
     </w:p>
     <w:p>
@@ -137,7 +137,7 @@
         <w:rPr>
           <w:color w:val="111827"/>
         </w:rPr>
-        <w:t xml:space="preserve">CATEGORY / SUBJECT / TOPIC set once at group level and inherited by all children.</w:t>
+        <w:t xml:space="preserve">Each child question uses QUESTION: / END_QUESTION with its own Marks and Negative Marks.</w:t>
       </w:r>
     </w:p>
     <w:p>
@@ -153,7 +153,7 @@
         <w:rPr>
           <w:color w:val="111827"/>
         </w:rPr>
-        <w:t xml:space="preserve">Each child question uses QUESTION: / END_QUESTION with its own Marks and Negative Marks.</w:t>
+        <w:t xml:space="preserve">Minimum 2, maximum 10 child questions per group.</w:t>
       </w:r>
     </w:p>
     <w:p>
@@ -169,7 +169,7 @@
         <w:rPr>
           <w:color w:val="111827"/>
         </w:rPr>
-        <w:t xml:space="preserve">Minimum 2, maximum 10 child questions per group.</w:t>
+        <w:t xml:space="preserve">Standalone questions may appear before or after any group.</w:t>
       </w:r>
     </w:p>
     <w:p>
@@ -185,7 +185,7 @@
         <w:rPr>
           <w:color w:val="111827"/>
         </w:rPr>
-        <w:t xml:space="preserve">Standalone questions (no GROUP_START) can appear before or after any group.</w:t>
+        <w:t xml:space="preserve">Paragraph images are shown once above all child questions.</w:t>
       </w:r>
     </w:p>
     <w:p>
@@ -207,7 +207,108 @@
           <w:bCs/>
           <w:color w:val="3730a3"/>
         </w:rPr>
-        <w:t xml:space="preserve">Example 1 — Reading Comprehension (text-only passage)</w:t>
+        <w:t xml:space="preserve">Rich Content in Groups</w:t>
+      </w:r>
+    </w:p>
+    <w:p>
+      <w:pPr>
+        <w:pStyle w:val="ListParagraph"/>
+        <w:numPr>
+          <w:ilvl w:val="0"/>
+          <w:numId w:val="1"/>
+        </w:numPr>
+        <w:spacing w:after="50" w:before="50"/>
+      </w:pPr>
+      <w:r>
+        <w:rPr>
+          <w:color w:val="111827"/>
+        </w:rPr>
+        <w:t xml:space="preserve">PASSAGE text may include bold/italic HTML formatting.</w:t>
+      </w:r>
+    </w:p>
+    <w:p>
+      <w:pPr>
+        <w:pStyle w:val="ListParagraph"/>
+        <w:numPr>
+          <w:ilvl w:val="0"/>
+          <w:numId w:val="1"/>
+        </w:numPr>
+        <w:spacing w:after="50" w:before="50"/>
+      </w:pPr>
+      <w:r>
+        <w:rPr>
+          <w:color w:val="111827"/>
+        </w:rPr>
+        <w:t xml:space="preserve">PASSAGE may include an image or screenshot below the Passage Image: label.</w:t>
+      </w:r>
+    </w:p>
+    <w:p>
+      <w:pPr>
+        <w:pStyle w:val="ListParagraph"/>
+        <w:numPr>
+          <w:ilvl w:val="0"/>
+          <w:numId w:val="1"/>
+        </w:numPr>
+        <w:spacing w:after="50" w:before="50"/>
+      </w:pPr>
+      <w:r>
+        <w:rPr>
+          <w:color w:val="111827"/>
+        </w:rPr>
+        <w:t xml:space="preserve">PASSAGE may include an equation in the Passage Equation: field.</w:t>
+      </w:r>
+    </w:p>
+    <w:p>
+      <w:pPr>
+        <w:pStyle w:val="ListParagraph"/>
+        <w:numPr>
+          <w:ilvl w:val="0"/>
+          <w:numId w:val="1"/>
+        </w:numPr>
+        <w:spacing w:after="50" w:before="50"/>
+      </w:pPr>
+      <w:r>
+        <w:rPr>
+          <w:color w:val="111827"/>
+        </w:rPr>
+        <w:t xml:space="preserve">Each child question's Question Rich Text, options, and explanation all support rich content.</w:t>
+      </w:r>
+    </w:p>
+    <w:p>
+      <w:pPr>
+        <w:shd w:fill="f0fdf4" w:color="auto" w:val="clear"/>
+        <w:spacing w:after="100" w:before="100"/>
+        <w:ind w:left="360" w:right="360"/>
+      </w:pPr>
+      <w:r>
+        <w:rPr>
+          <w:color w:val="166534"/>
+          <w:sz w:val="18"/>
+          <w:szCs w:val="18"/>
+        </w:rPr>
+        <w:t xml:space="preserve">✓ Screenshots in passages are supported. Crop to the relevant content for best readability.</w:t>
+      </w:r>
+    </w:p>
+    <w:p>
+      <w:pPr>
+        <w:pBdr>
+          <w:bottom w:val="single" w:color="c7d2fe" w:sz="6"/>
+        </w:pBdr>
+        <w:spacing w:after="200" w:before="200"/>
+      </w:pPr>
+    </w:p>
+    <w:p>
+      <w:pPr>
+        <w:pStyle w:val="Heading2"/>
+        <w:spacing w:after="120" w:before="260"/>
+      </w:pPr>
+      <w:r>
+        <w:rPr>
+          <w:b/>
+          <w:bCs/>
+          <w:color w:val="3730a3"/>
+        </w:rPr>
+        <w:t xml:space="preserve">Example 1 — Reading Comprehension with Rich Text Passage</w:t>
       </w:r>
     </w:p>
     <w:p>
@@ -254,7 +355,7 @@
           <w:sz w:val="18"/>
           <w:szCs w:val="18"/>
         </w:rPr>
-        <w:t xml:space="preserve">The Reserve Bank of India (RBI) was established on 1 April 1935 under the Reserve Bank of India Act, 1934. It serves as the central bank of the country and is responsible for the issue and supply of the Indian rupee and the regulation of the Indian banking system. The RBI also manages foreign exchange reserves under FEMA. Its headquarters is in Mumbai, Maharashtra.</w:t>
+        <w:t xml:space="preserve">The &lt;b&gt;Reserve Bank of India (RBI)&lt;/b&gt; was established on &lt;b&gt;1 April 1935&lt;/b&gt; under the Reserve Bank of India Act, 1934. It serves as the &lt;i&gt;central bank&lt;/i&gt; of India and is responsible for the issue and supply of the Indian rupee, the regulation of the banking system, and management of foreign exchange reserves under FEMA. Its headquarters is in &lt;b&gt;Mumbai&lt;/b&gt;.</w:t>
       </w:r>
     </w:p>
     <w:p>
@@ -399,47 +500,47 @@
           <w:bCs/>
           <w:color w:val="374151"/>
         </w:rPr>
-        <w:t xml:space="preserve">Question: </w:t>
-      </w:r>
-      <w:r>
-        <w:rPr>
-          <w:color w:val="111827"/>
-        </w:rPr>
-        <w:t xml:space="preserve">When was the RBI established?</w:t>
-      </w:r>
-    </w:p>
-    <w:p>
-      <w:pPr>
-        <w:spacing w:after="60" w:before="60"/>
-        <w:ind w:left="360"/>
-      </w:pPr>
-      <w:r>
-        <w:rPr>
-          <w:b/>
-          <w:bCs/>
-          <w:color w:val="374151"/>
-        </w:rPr>
-        <w:t xml:space="preserve">Option A: </w:t>
-      </w:r>
-      <w:r>
-        <w:rPr>
-          <w:color w:val="111827"/>
-        </w:rPr>
-        <w:t xml:space="preserve">1 April 1935</w:t>
-      </w:r>
-    </w:p>
-    <w:p>
-      <w:pPr>
-        <w:spacing w:after="60" w:before="60"/>
-        <w:ind w:left="360"/>
-      </w:pPr>
-      <w:r>
-        <w:rPr>
-          <w:b/>
-          <w:bCs/>
-          <w:color w:val="374151"/>
-        </w:rPr>
-        <w:t xml:space="preserve">Option B: </w:t>
+        <w:t xml:space="preserve">Question Rich Text: </w:t>
+      </w:r>
+      <w:r>
+        <w:rPr>
+          <w:color w:val="111827"/>
+        </w:rPr>
+        <w:t xml:space="preserve">When was the &lt;b&gt;RBI&lt;/b&gt; established?</w:t>
+      </w:r>
+    </w:p>
+    <w:p>
+      <w:pPr>
+        <w:spacing w:after="60" w:before="60"/>
+        <w:ind w:left="360"/>
+      </w:pPr>
+      <w:r>
+        <w:rPr>
+          <w:b/>
+          <w:bCs/>
+          <w:color w:val="374151"/>
+        </w:rPr>
+        <w:t xml:space="preserve">Option A Rich Text: </w:t>
+      </w:r>
+      <w:r>
+        <w:rPr>
+          <w:color w:val="111827"/>
+        </w:rPr>
+        <w:t xml:space="preserve">&lt;b&gt;1 April 1935&lt;/b&gt;</w:t>
+      </w:r>
+    </w:p>
+    <w:p>
+      <w:pPr>
+        <w:spacing w:after="60" w:before="60"/>
+        <w:ind w:left="360"/>
+      </w:pPr>
+      <w:r>
+        <w:rPr>
+          <w:b/>
+          <w:bCs/>
+          <w:color w:val="374151"/>
+        </w:rPr>
+        <w:t xml:space="preserve">Option B Rich Text: </w:t>
       </w:r>
       <w:r>
         <w:rPr>
@@ -459,7 +560,7 @@
           <w:bCs/>
           <w:color w:val="374151"/>
         </w:rPr>
-        <w:t xml:space="preserve">Option C: </w:t>
+        <w:t xml:space="preserve">Option C Rich Text: </w:t>
       </w:r>
       <w:r>
         <w:rPr>
@@ -479,7 +580,7 @@
           <w:bCs/>
           <w:color w:val="374151"/>
         </w:rPr>
-        <w:t xml:space="preserve">Option D: </w:t>
+        <w:t xml:space="preserve">Option D Rich Text: </w:t>
       </w:r>
       <w:r>
         <w:rPr>
@@ -519,13 +620,13 @@
           <w:bCs/>
           <w:color w:val="374151"/>
         </w:rPr>
-        <w:t xml:space="preserve">Explanation: </w:t>
-      </w:r>
-      <w:r>
-        <w:rPr>
-          <w:color w:val="111827"/>
-        </w:rPr>
-        <w:t xml:space="preserve">The RBI was established on 1 April 1935 under the RBI Act, 1934.</w:t>
+        <w:t xml:space="preserve">Explanation Rich Text: </w:t>
+      </w:r>
+      <w:r>
+        <w:rPr>
+          <w:color w:val="111827"/>
+        </w:rPr>
+        <w:t xml:space="preserve">The RBI was established on &lt;b&gt;1 April 1935&lt;/b&gt; under the RBI Act, 1934.</w:t>
       </w:r>
     </w:p>
     <w:p>
@@ -662,27 +763,27 @@
           <w:bCs/>
           <w:color w:val="374151"/>
         </w:rPr>
-        <w:t xml:space="preserve">Question: </w:t>
-      </w:r>
-      <w:r>
-        <w:rPr>
-          <w:color w:val="111827"/>
-        </w:rPr>
-        <w:t xml:space="preserve">Under which Act does the RBI manage India's foreign exchange reserves?</w:t>
-      </w:r>
-    </w:p>
-    <w:p>
-      <w:pPr>
-        <w:spacing w:after="60" w:before="60"/>
-        <w:ind w:left="360"/>
-      </w:pPr>
-      <w:r>
-        <w:rPr>
-          <w:b/>
-          <w:bCs/>
-          <w:color w:val="374151"/>
-        </w:rPr>
-        <w:t xml:space="preserve">Option A: </w:t>
+        <w:t xml:space="preserve">Question Rich Text: </w:t>
+      </w:r>
+      <w:r>
+        <w:rPr>
+          <w:color w:val="111827"/>
+        </w:rPr>
+        <w:t xml:space="preserve">Under which Act does the RBI manage India's &lt;i&gt;foreign exchange reserves&lt;/i&gt;?</w:t>
+      </w:r>
+    </w:p>
+    <w:p>
+      <w:pPr>
+        <w:spacing w:after="60" w:before="60"/>
+        <w:ind w:left="360"/>
+      </w:pPr>
+      <w:r>
+        <w:rPr>
+          <w:b/>
+          <w:bCs/>
+          <w:color w:val="374151"/>
+        </w:rPr>
+        <w:t xml:space="preserve">Option A Rich Text: </w:t>
       </w:r>
       <w:r>
         <w:rPr>
@@ -702,7 +803,7 @@
           <w:bCs/>
           <w:color w:val="374151"/>
         </w:rPr>
-        <w:t xml:space="preserve">Option B: </w:t>
+        <w:t xml:space="preserve">Option B Rich Text: </w:t>
       </w:r>
       <w:r>
         <w:rPr>
@@ -722,27 +823,27 @@
           <w:bCs/>
           <w:color w:val="374151"/>
         </w:rPr>
-        <w:t xml:space="preserve">Option C: </w:t>
-      </w:r>
-      <w:r>
-        <w:rPr>
-          <w:color w:val="111827"/>
-        </w:rPr>
-        <w:t xml:space="preserve">Foreign Exchange Management Act (FEMA)</w:t>
-      </w:r>
-    </w:p>
-    <w:p>
-      <w:pPr>
-        <w:spacing w:after="60" w:before="60"/>
-        <w:ind w:left="360"/>
-      </w:pPr>
-      <w:r>
-        <w:rPr>
-          <w:b/>
-          <w:bCs/>
-          <w:color w:val="374151"/>
-        </w:rPr>
-        <w:t xml:space="preserve">Option D: </w:t>
+        <w:t xml:space="preserve">Option C Rich Text: </w:t>
+      </w:r>
+      <w:r>
+        <w:rPr>
+          <w:color w:val="111827"/>
+        </w:rPr>
+        <w:t xml:space="preserve">&lt;b&gt;Foreign Exchange Management Act (FEMA)&lt;/b&gt;</w:t>
+      </w:r>
+    </w:p>
+    <w:p>
+      <w:pPr>
+        <w:spacing w:after="60" w:before="60"/>
+        <w:ind w:left="360"/>
+      </w:pPr>
+      <w:r>
+        <w:rPr>
+          <w:b/>
+          <w:bCs/>
+          <w:color w:val="374151"/>
+        </w:rPr>
+        <w:t xml:space="preserve">Option D Rich Text: </w:t>
       </w:r>
       <w:r>
         <w:rPr>
@@ -782,7 +883,7 @@
           <w:bCs/>
           <w:color w:val="374151"/>
         </w:rPr>
-        <w:t xml:space="preserve">Explanation: </w:t>
+        <w:t xml:space="preserve">Explanation Rich Text: </w:t>
       </w:r>
       <w:r>
         <w:rPr>
@@ -925,27 +1026,27 @@
           <w:bCs/>
           <w:color w:val="374151"/>
         </w:rPr>
-        <w:t xml:space="preserve">Question: </w:t>
-      </w:r>
-      <w:r>
-        <w:rPr>
-          <w:color w:val="111827"/>
-        </w:rPr>
-        <w:t xml:space="preserve">Where is the RBI headquarters located?</w:t>
-      </w:r>
-    </w:p>
-    <w:p>
-      <w:pPr>
-        <w:spacing w:after="60" w:before="60"/>
-        <w:ind w:left="360"/>
-      </w:pPr>
-      <w:r>
-        <w:rPr>
-          <w:b/>
-          <w:bCs/>
-          <w:color w:val="374151"/>
-        </w:rPr>
-        <w:t xml:space="preserve">Option A: </w:t>
+        <w:t xml:space="preserve">Question Rich Text: </w:t>
+      </w:r>
+      <w:r>
+        <w:rPr>
+          <w:color w:val="111827"/>
+        </w:rPr>
+        <w:t xml:space="preserve">Where is the &lt;b&gt;RBI headquarters&lt;/b&gt; located?</w:t>
+      </w:r>
+    </w:p>
+    <w:p>
+      <w:pPr>
+        <w:spacing w:after="60" w:before="60"/>
+        <w:ind w:left="360"/>
+      </w:pPr>
+      <w:r>
+        <w:rPr>
+          <w:b/>
+          <w:bCs/>
+          <w:color w:val="374151"/>
+        </w:rPr>
+        <w:t xml:space="preserve">Option A Rich Text: </w:t>
       </w:r>
       <w:r>
         <w:rPr>
@@ -965,7 +1066,7 @@
           <w:bCs/>
           <w:color w:val="374151"/>
         </w:rPr>
-        <w:t xml:space="preserve">Option B: </w:t>
+        <w:t xml:space="preserve">Option B Rich Text: </w:t>
       </w:r>
       <w:r>
         <w:rPr>
@@ -985,7 +1086,7 @@
           <w:bCs/>
           <w:color w:val="374151"/>
         </w:rPr>
-        <w:t xml:space="preserve">Option C: </w:t>
+        <w:t xml:space="preserve">Option C Rich Text: </w:t>
       </w:r>
       <w:r>
         <w:rPr>
@@ -1005,13 +1106,13 @@
           <w:bCs/>
           <w:color w:val="374151"/>
         </w:rPr>
-        <w:t xml:space="preserve">Option D: </w:t>
-      </w:r>
-      <w:r>
-        <w:rPr>
-          <w:color w:val="111827"/>
-        </w:rPr>
-        <w:t xml:space="preserve">Mumbai</w:t>
+        <w:t xml:space="preserve">Option D Rich Text: </w:t>
+      </w:r>
+      <w:r>
+        <w:rPr>
+          <w:color w:val="111827"/>
+        </w:rPr>
+        <w:t xml:space="preserve">&lt;b&gt;Mumbai&lt;/b&gt;</w:t>
       </w:r>
     </w:p>
     <w:p>
@@ -1045,13 +1146,13 @@
           <w:bCs/>
           <w:color w:val="374151"/>
         </w:rPr>
-        <w:t xml:space="preserve">Explanation: </w:t>
-      </w:r>
-      <w:r>
-        <w:rPr>
-          <w:color w:val="111827"/>
-        </w:rPr>
-        <w:t xml:space="preserve">The RBI headquarters is in Mumbai, Maharashtra.</w:t>
+        <w:t xml:space="preserve">Explanation Rich Text: </w:t>
+      </w:r>
+      <w:r>
+        <w:rPr>
+          <w:color w:val="111827"/>
+        </w:rPr>
+        <w:t xml:space="preserve">The RBI headquarters is in &lt;b&gt;Mumbai&lt;/b&gt;, Maharashtra.</w:t>
       </w:r>
     </w:p>
     <w:p>
@@ -1185,18 +1286,7 @@
           <w:bCs/>
           <w:color w:val="3730a3"/>
         </w:rPr>
-        <w:t xml:space="preserve">Example 2 — Data Interpretation with Screenshot Passage</w:t>
-      </w:r>
-    </w:p>
-    <w:p>
-      <w:pPr>
-        <w:spacing w:after="80" w:before="80"/>
-      </w:pPr>
-      <w:r>
-        <w:rPr>
-          <w:color w:val="6b7280"/>
-        </w:rPr>
-        <w:t xml:space="preserve">Use this format when the DI set is based on a chart or table supplied as a screenshot.</w:t>
+        <w:t xml:space="preserve">Example 2 — DI Group with Screenshot Passage and Equation</w:t>
       </w:r>
     </w:p>
     <w:p>
@@ -1242,13 +1332,13 @@
           <w:bCs/>
           <w:color w:val="374151"/>
         </w:rPr>
-        <w:t xml:space="preserve">Passage Text: </w:t>
-      </w:r>
-      <w:r>
-        <w:rPr>
-          <w:color w:val="111827"/>
-        </w:rPr>
-        <w:t xml:space="preserve">Study the bar chart below showing India's export revenues (₹ crore) from 2018 to 2023, then answer the questions.</w:t>
+        <w:t xml:space="preserve">Passage Rich Text: </w:t>
+      </w:r>
+      <w:r>
+        <w:rPr>
+          <w:color w:val="111827"/>
+        </w:rPr>
+        <w:t xml:space="preserve">Study the bar chart below showing India's &lt;b&gt;export revenues (₹ crore)&lt;/b&gt; from 2018 to 2023, then answer the questions.</w:t>
       </w:r>
     </w:p>
     <w:p>
@@ -1279,7 +1369,7 @@
         <w:rPr>
           <w:color w:val="6b7280"/>
         </w:rPr>
-        <w:t xml:space="preserve">        ↑ In DOCX: insert screenshot inline here, below this label line.</w:t>
+        <w:t xml:space="preserve">        ↑ In DOCX: insert screenshot inline here below this label.</w:t>
       </w:r>
     </w:p>
     <w:p>
@@ -1404,13 +1494,13 @@
           <w:bCs/>
           <w:color w:val="374151"/>
         </w:rPr>
-        <w:t xml:space="preserve">Question: </w:t>
-      </w:r>
-      <w:r>
-        <w:rPr>
-          <w:color w:val="111827"/>
-        </w:rPr>
-        <w:t xml:space="preserve">In which year was export revenue highest?</w:t>
+        <w:t xml:space="preserve">Question Rich Text: </w:t>
+      </w:r>
+      <w:r>
+        <w:rPr>
+          <w:color w:val="111827"/>
+        </w:rPr>
+        <w:t xml:space="preserve">In which year was export revenue &lt;b&gt;highest&lt;/b&gt;?</w:t>
       </w:r>
     </w:p>
     <w:p>
@@ -1444,7 +1534,7 @@
           <w:bCs/>
           <w:color w:val="374151"/>
         </w:rPr>
-        <w:t xml:space="preserve">Option A: </w:t>
+        <w:t xml:space="preserve">Option A Rich Text: </w:t>
       </w:r>
       <w:r>
         <w:rPr>
@@ -1464,7 +1554,7 @@
           <w:bCs/>
           <w:color w:val="374151"/>
         </w:rPr>
-        <w:t xml:space="preserve">Option B: </w:t>
+        <w:t xml:space="preserve">Option B Rich Text: </w:t>
       </w:r>
       <w:r>
         <w:rPr>
@@ -1484,27 +1574,27 @@
           <w:bCs/>
           <w:color w:val="374151"/>
         </w:rPr>
-        <w:t xml:space="preserve">Option C: </w:t>
-      </w:r>
-      <w:r>
-        <w:rPr>
-          <w:color w:val="111827"/>
-        </w:rPr>
-        <w:t xml:space="preserve">2021</w:t>
-      </w:r>
-    </w:p>
-    <w:p>
-      <w:pPr>
-        <w:spacing w:after="60" w:before="60"/>
-        <w:ind w:left="360"/>
-      </w:pPr>
-      <w:r>
-        <w:rPr>
-          <w:b/>
-          <w:bCs/>
-          <w:color w:val="374151"/>
-        </w:rPr>
-        <w:t xml:space="preserve">Option D: </w:t>
+        <w:t xml:space="preserve">Option C Rich Text: </w:t>
+      </w:r>
+      <w:r>
+        <w:rPr>
+          <w:color w:val="111827"/>
+        </w:rPr>
+        <w:t xml:space="preserve">&lt;b&gt;2021&lt;/b&gt;</w:t>
+      </w:r>
+    </w:p>
+    <w:p>
+      <w:pPr>
+        <w:spacing w:after="60" w:before="60"/>
+        <w:ind w:left="360"/>
+      </w:pPr>
+      <w:r>
+        <w:rPr>
+          <w:b/>
+          <w:bCs/>
+          <w:color w:val="374151"/>
+        </w:rPr>
+        <w:t xml:space="preserve">Option D Rich Text: </w:t>
       </w:r>
       <w:r>
         <w:rPr>
@@ -1544,13 +1634,13 @@
           <w:bCs/>
           <w:color w:val="374151"/>
         </w:rPr>
-        <w:t xml:space="preserve">Explanation: </w:t>
-      </w:r>
-      <w:r>
-        <w:rPr>
-          <w:color w:val="111827"/>
-        </w:rPr>
-        <w:t xml:space="preserve">The tallest bar in the chart corresponds to 2021.</w:t>
+        <w:t xml:space="preserve">Explanation Rich Text: </w:t>
+      </w:r>
+      <w:r>
+        <w:rPr>
+          <w:color w:val="111827"/>
+        </w:rPr>
+        <w:t xml:space="preserve">The tallest bar in the chart corresponds to &lt;b&gt;2021&lt;/b&gt;.</w:t>
       </w:r>
     </w:p>
     <w:p>
@@ -1707,7 +1797,7 @@
           <w:bCs/>
           <w:color w:val="374151"/>
         </w:rPr>
-        <w:t xml:space="preserve">Question: </w:t>
+        <w:t xml:space="preserve">Question Rich Text: </w:t>
       </w:r>
       <w:r>
         <w:rPr>
@@ -1747,7 +1837,7 @@
           <w:bCs/>
           <w:color w:val="374151"/>
         </w:rPr>
-        <w:t xml:space="preserve">Option A: </w:t>
+        <w:t xml:space="preserve">Option A Rich Text: </w:t>
       </w:r>
       <w:r>
         <w:rPr>
@@ -1767,27 +1857,27 @@
           <w:bCs/>
           <w:color w:val="374151"/>
         </w:rPr>
-        <w:t xml:space="preserve">Option B: </w:t>
-      </w:r>
-      <w:r>
-        <w:rPr>
-          <w:color w:val="111827"/>
-        </w:rPr>
-        <w:t xml:space="preserve">3 : 5</w:t>
-      </w:r>
-    </w:p>
-    <w:p>
-      <w:pPr>
-        <w:spacing w:after="60" w:before="60"/>
-        <w:ind w:left="360"/>
-      </w:pPr>
-      <w:r>
-        <w:rPr>
-          <w:b/>
-          <w:bCs/>
-          <w:color w:val="374151"/>
-        </w:rPr>
-        <w:t xml:space="preserve">Option C: </w:t>
+        <w:t xml:space="preserve">Option B Rich Text: </w:t>
+      </w:r>
+      <w:r>
+        <w:rPr>
+          <w:color w:val="111827"/>
+        </w:rPr>
+        <w:t xml:space="preserve">&lt;b&gt;3 : 5&lt;/b&gt;</w:t>
+      </w:r>
+    </w:p>
+    <w:p>
+      <w:pPr>
+        <w:spacing w:after="60" w:before="60"/>
+        <w:ind w:left="360"/>
+      </w:pPr>
+      <w:r>
+        <w:rPr>
+          <w:b/>
+          <w:bCs/>
+          <w:color w:val="374151"/>
+        </w:rPr>
+        <w:t xml:space="preserve">Option C Rich Text: </w:t>
       </w:r>
       <w:r>
         <w:rPr>
@@ -1807,7 +1897,7 @@
           <w:bCs/>
           <w:color w:val="374151"/>
         </w:rPr>
-        <w:t xml:space="preserve">Option D: </w:t>
+        <w:t xml:space="preserve">Option D Rich Text: </w:t>
       </w:r>
       <w:r>
         <w:rPr>
@@ -1847,13 +1937,13 @@
           <w:bCs/>
           <w:color w:val="374151"/>
         </w:rPr>
-        <w:t xml:space="preserve">Explanation: </w:t>
-      </w:r>
-      <w:r>
-        <w:rPr>
-          <w:color w:val="111827"/>
-        </w:rPr>
-        <w:t xml:space="preserve">Reading from the chart: 2019 ≈ 3 units, 2022 ≈ 5 units → ratio 3:5.</w:t>
+        <w:t xml:space="preserve">Explanation Rich Text: </w:t>
+      </w:r>
+      <w:r>
+        <w:rPr>
+          <w:color w:val="111827"/>
+        </w:rPr>
+        <w:t xml:space="preserve">Reading from the chart: 2019 ≈ 3 units, 2022 ≈ 5 units → ratio &lt;b&gt;3:5&lt;/b&gt;.</w:t>
       </w:r>
     </w:p>
     <w:p>
@@ -1987,7 +2077,7 @@
           <w:bCs/>
           <w:color w:val="3730a3"/>
         </w:rPr>
-        <w:t xml:space="preserve">Example 3 — Standalone Question After Group</w:t>
+        <w:t xml:space="preserve">Standalone Question After Group</w:t>
       </w:r>
     </w:p>
     <w:p>
@@ -1998,7 +2088,7 @@
         <w:rPr>
           <w:color w:val="6b7280"/>
         </w:rPr>
-        <w:t xml:space="preserve">Proves that standalone questions can follow groups in the same file.</w:t>
+        <w:t xml:space="preserve">Standalone questions use QUESTION: / END_QUESTION outside any group:</w:t>
       </w:r>
     </w:p>
     <w:p>
@@ -2028,27 +2118,27 @@
           <w:bCs/>
           <w:color w:val="374151"/>
         </w:rPr>
-        <w:t xml:space="preserve">Question: </w:t>
-      </w:r>
-      <w:r>
-        <w:rPr>
-          <w:color w:val="111827"/>
-        </w:rPr>
-        <w:t xml:space="preserve">Which of the following is NOT a function of the RBI?</w:t>
-      </w:r>
-    </w:p>
-    <w:p>
-      <w:pPr>
-        <w:spacing w:after="60" w:before="60"/>
-        <w:ind w:left="360"/>
-      </w:pPr>
-      <w:r>
-        <w:rPr>
-          <w:b/>
-          <w:bCs/>
-          <w:color w:val="374151"/>
-        </w:rPr>
-        <w:t xml:space="preserve">Option A: </w:t>
+        <w:t xml:space="preserve">Question Rich Text: </w:t>
+      </w:r>
+      <w:r>
+        <w:rPr>
+          <w:color w:val="111827"/>
+        </w:rPr>
+        <w:t xml:space="preserve">Which of the following is &lt;b&gt;NOT&lt;/b&gt; a function of the RBI?</w:t>
+      </w:r>
+    </w:p>
+    <w:p>
+      <w:pPr>
+        <w:spacing w:after="60" w:before="60"/>
+        <w:ind w:left="360"/>
+      </w:pPr>
+      <w:r>
+        <w:rPr>
+          <w:b/>
+          <w:bCs/>
+          <w:color w:val="374151"/>
+        </w:rPr>
+        <w:t xml:space="preserve">Option A Rich Text: </w:t>
       </w:r>
       <w:r>
         <w:rPr>
@@ -2068,7 +2158,7 @@
           <w:bCs/>
           <w:color w:val="374151"/>
         </w:rPr>
-        <w:t xml:space="preserve">Option B: </w:t>
+        <w:t xml:space="preserve">Option B Rich Text: </w:t>
       </w:r>
       <w:r>
         <w:rPr>
@@ -2088,27 +2178,27 @@
           <w:bCs/>
           <w:color w:val="374151"/>
         </w:rPr>
-        <w:t xml:space="preserve">Option C: </w:t>
-      </w:r>
-      <w:r>
-        <w:rPr>
-          <w:color w:val="111827"/>
-        </w:rPr>
-        <w:t xml:space="preserve">Collecting direct taxes</w:t>
-      </w:r>
-    </w:p>
-    <w:p>
-      <w:pPr>
-        <w:spacing w:after="60" w:before="60"/>
-        <w:ind w:left="360"/>
-      </w:pPr>
-      <w:r>
-        <w:rPr>
-          <w:b/>
-          <w:bCs/>
-          <w:color w:val="374151"/>
-        </w:rPr>
-        <w:t xml:space="preserve">Option D: </w:t>
+        <w:t xml:space="preserve">Option C Rich Text: </w:t>
+      </w:r>
+      <w:r>
+        <w:rPr>
+          <w:color w:val="111827"/>
+        </w:rPr>
+        <w:t xml:space="preserve">&lt;b&gt;Collecting direct taxes&lt;/b&gt;</w:t>
+      </w:r>
+    </w:p>
+    <w:p>
+      <w:pPr>
+        <w:spacing w:after="60" w:before="60"/>
+        <w:ind w:left="360"/>
+      </w:pPr>
+      <w:r>
+        <w:rPr>
+          <w:b/>
+          <w:bCs/>
+          <w:color w:val="374151"/>
+        </w:rPr>
+        <w:t xml:space="preserve">Option D Rich Text: </w:t>
       </w:r>
       <w:r>
         <w:rPr>
@@ -2148,13 +2238,13 @@
           <w:bCs/>
           <w:color w:val="374151"/>
         </w:rPr>
-        <w:t xml:space="preserve">Explanation: </w:t>
-      </w:r>
-      <w:r>
-        <w:rPr>
-          <w:color w:val="111827"/>
-        </w:rPr>
-        <w:t xml:space="preserve">Collecting direct taxes is done by the Income Tax Department, not the RBI.</w:t>
+        <w:t xml:space="preserve">Explanation Rich Text: </w:t>
+      </w:r>
+      <w:r>
+        <w:rPr>
+          <w:color w:val="111827"/>
+        </w:rPr>
+        <w:t xml:space="preserve">Collecting direct taxes is done by the Income Tax Department, &lt;i&gt;not&lt;/i&gt; the RBI.</w:t>
       </w:r>
     </w:p>
     <w:p>
@@ -2372,6 +2462,8 @@
         <w:gridCol w:w="100"/>
         <w:gridCol w:w="100"/>
         <w:gridCol w:w="100"/>
+        <w:gridCol w:w="100"/>
+        <w:gridCol w:w="100"/>
       </w:tblGrid>
       <w:tr>
         <w:trPr>
@@ -2433,7 +2525,7 @@
                 <w:sz w:val="18"/>
                 <w:szCs w:val="18"/>
               </w:rPr>
-              <w:t xml:space="preserve">Supports Image/Equation</w:t>
+              <w:t xml:space="preserve">Rich Text</w:t>
             </w:r>
           </w:p>
         </w:tc>
@@ -2453,6 +2545,46 @@
                 <w:sz w:val="18"/>
                 <w:szCs w:val="18"/>
               </w:rPr>
+              <w:t xml:space="preserve">Image</w:t>
+            </w:r>
+          </w:p>
+        </w:tc>
+        <w:tc>
+          <w:tcPr>
+            <w:shd w:fill="4f46e5" w:color="auto" w:val="clear"/>
+          </w:tcPr>
+          <w:p>
+            <w:pPr>
+              <w:jc w:val="center"/>
+            </w:pPr>
+            <w:r>
+              <w:rPr>
+                <w:b/>
+                <w:bCs/>
+                <w:color w:val="ffffff"/>
+                <w:sz w:val="18"/>
+                <w:szCs w:val="18"/>
+              </w:rPr>
+              <w:t xml:space="preserve">Equation</w:t>
+            </w:r>
+          </w:p>
+        </w:tc>
+        <w:tc>
+          <w:tcPr>
+            <w:shd w:fill="4f46e5" w:color="auto" w:val="clear"/>
+          </w:tcPr>
+          <w:p>
+            <w:pPr>
+              <w:jc w:val="center"/>
+            </w:pPr>
+            <w:r>
+              <w:rPr>
+                <w:b/>
+                <w:bCs/>
+                <w:color w:val="ffffff"/>
+                <w:sz w:val="18"/>
+                <w:szCs w:val="18"/>
+              </w:rPr>
               <w:t xml:space="preserve">Notes</w:t>
             </w:r>
           </w:p>
@@ -2515,7 +2647,37 @@
                 <w:sz w:val="18"/>
                 <w:szCs w:val="18"/>
               </w:rPr>
-              <w:t xml:space="preserve">Marks start; include a short identifier</w:t>
+              <w:t xml:space="preserve">—</w:t>
+            </w:r>
+          </w:p>
+        </w:tc>
+        <w:tc>
+          <w:tcPr>
+            <w:shd w:fill="f8f9ff" w:color="auto" w:val="clear"/>
+          </w:tcPr>
+          <w:p>
+            <w:r>
+              <w:rPr>
+                <w:color w:val="111827"/>
+                <w:sz w:val="18"/>
+                <w:szCs w:val="18"/>
+              </w:rPr>
+              <w:t xml:space="preserve">—</w:t>
+            </w:r>
+          </w:p>
+        </w:tc>
+        <w:tc>
+          <w:tcPr>
+            <w:shd w:fill="f8f9ff" w:color="auto" w:val="clear"/>
+          </w:tcPr>
+          <w:p>
+            <w:r>
+              <w:rPr>
+                <w:color w:val="111827"/>
+                <w:sz w:val="18"/>
+                <w:szCs w:val="18"/>
+              </w:rPr>
+              <w:t xml:space="preserve">Marks start; include short identifier</w:t>
             </w:r>
           </w:p>
         </w:tc>
@@ -2562,7 +2724,37 @@
                 <w:sz w:val="18"/>
                 <w:szCs w:val="18"/>
               </w:rPr>
-              <w:t xml:space="preserve">Passage Image + Passage Equation</w:t>
+              <w:t xml:space="preserve">Yes — HTML formatting</w:t>
+            </w:r>
+          </w:p>
+        </w:tc>
+        <w:tc>
+          <w:tcPr>
+            <w:shd w:fill="ffffff" w:color="auto" w:val="clear"/>
+          </w:tcPr>
+          <w:p>
+            <w:r>
+              <w:rPr>
+                <w:color w:val="111827"/>
+                <w:sz w:val="18"/>
+                <w:szCs w:val="18"/>
+              </w:rPr>
+              <w:t xml:space="preserve">Passage Image field</w:t>
+            </w:r>
+          </w:p>
+        </w:tc>
+        <w:tc>
+          <w:tcPr>
+            <w:shd w:fill="ffffff" w:color="auto" w:val="clear"/>
+          </w:tcPr>
+          <w:p>
+            <w:r>
+              <w:rPr>
+                <w:color w:val="111827"/>
+                <w:sz w:val="18"/>
+                <w:szCs w:val="18"/>
+              </w:rPr>
+              <w:t xml:space="preserve">Passage Equation field</w:t>
             </w:r>
           </w:p>
         </w:tc>
@@ -2624,6 +2816,21 @@
                 <w:sz w:val="18"/>
                 <w:szCs w:val="18"/>
               </w:rPr>
+              <w:t xml:space="preserve">—</w:t>
+            </w:r>
+          </w:p>
+        </w:tc>
+        <w:tc>
+          <w:tcPr>
+            <w:shd w:fill="f8f9ff" w:color="auto" w:val="clear"/>
+          </w:tcPr>
+          <w:p>
+            <w:r>
+              <w:rPr>
+                <w:color w:val="111827"/>
+                <w:sz w:val="18"/>
+                <w:szCs w:val="18"/>
+              </w:rPr>
               <w:t xml:space="preserve">Yes — screenshot or chart</w:t>
             </w:r>
           </w:p>
@@ -2639,7 +2846,22 @@
                 <w:sz w:val="18"/>
                 <w:szCs w:val="18"/>
               </w:rPr>
-              <w:t xml:space="preserve">Displayed above all child questions</w:t>
+              <w:t xml:space="preserve">—</w:t>
+            </w:r>
+          </w:p>
+        </w:tc>
+        <w:tc>
+          <w:tcPr>
+            <w:shd w:fill="f8f9ff" w:color="auto" w:val="clear"/>
+          </w:tcPr>
+          <w:p>
+            <w:r>
+              <w:rPr>
+                <w:color w:val="111827"/>
+                <w:sz w:val="18"/>
+                <w:szCs w:val="18"/>
+              </w:rPr>
+              <w:t xml:space="preserve">Shown above all child questions</w:t>
             </w:r>
           </w:p>
         </w:tc>
@@ -2686,7 +2908,37 @@
                 <w:sz w:val="18"/>
                 <w:szCs w:val="18"/>
               </w:rPr>
-              <w:t xml:space="preserve">Yes — plain-text or image</w:t>
+              <w:t xml:space="preserve">—</w:t>
+            </w:r>
+          </w:p>
+        </w:tc>
+        <w:tc>
+          <w:tcPr>
+            <w:shd w:fill="ffffff" w:color="auto" w:val="clear"/>
+          </w:tcPr>
+          <w:p>
+            <w:r>
+              <w:rPr>
+                <w:color w:val="111827"/>
+                <w:sz w:val="18"/>
+                <w:szCs w:val="18"/>
+              </w:rPr>
+              <w:t xml:space="preserve">—</w:t>
+            </w:r>
+          </w:p>
+        </w:tc>
+        <w:tc>
+          <w:tcPr>
+            <w:shd w:fill="ffffff" w:color="auto" w:val="clear"/>
+          </w:tcPr>
+          <w:p>
+            <w:r>
+              <w:rPr>
+                <w:color w:val="111827"/>
+                <w:sz w:val="18"/>
+                <w:szCs w:val="18"/>
+              </w:rPr>
+              <w:t xml:space="preserve">Yes</w:t>
             </w:r>
           </w:p>
         </w:tc>
@@ -2763,6 +3015,36 @@
                 <w:sz w:val="18"/>
                 <w:szCs w:val="18"/>
               </w:rPr>
+              <w:t xml:space="preserve">—</w:t>
+            </w:r>
+          </w:p>
+        </w:tc>
+        <w:tc>
+          <w:tcPr>
+            <w:shd w:fill="f8f9ff" w:color="auto" w:val="clear"/>
+          </w:tcPr>
+          <w:p>
+            <w:r>
+              <w:rPr>
+                <w:color w:val="111827"/>
+                <w:sz w:val="18"/>
+                <w:szCs w:val="18"/>
+              </w:rPr>
+              <w:t xml:space="preserve">—</w:t>
+            </w:r>
+          </w:p>
+        </w:tc>
+        <w:tc>
+          <w:tcPr>
+            <w:shd w:fill="f8f9ff" w:color="auto" w:val="clear"/>
+          </w:tcPr>
+          <w:p>
+            <w:r>
+              <w:rPr>
+                <w:color w:val="111827"/>
+                <w:sz w:val="18"/>
+                <w:szCs w:val="18"/>
+              </w:rPr>
               <w:t xml:space="preserve">Set once; inherited by all children</w:t>
             </w:r>
           </w:p>
@@ -2825,6 +3107,36 @@
                 <w:sz w:val="18"/>
                 <w:szCs w:val="18"/>
               </w:rPr>
+              <w:t xml:space="preserve">—</w:t>
+            </w:r>
+          </w:p>
+        </w:tc>
+        <w:tc>
+          <w:tcPr>
+            <w:shd w:fill="ffffff" w:color="auto" w:val="clear"/>
+          </w:tcPr>
+          <w:p>
+            <w:r>
+              <w:rPr>
+                <w:color w:val="111827"/>
+                <w:sz w:val="18"/>
+                <w:szCs w:val="18"/>
+              </w:rPr>
+              <w:t xml:space="preserve">—</w:t>
+            </w:r>
+          </w:p>
+        </w:tc>
+        <w:tc>
+          <w:tcPr>
+            <w:shd w:fill="ffffff" w:color="auto" w:val="clear"/>
+          </w:tcPr>
+          <w:p>
+            <w:r>
+              <w:rPr>
+                <w:color w:val="111827"/>
+                <w:sz w:val="18"/>
+                <w:szCs w:val="18"/>
+              </w:rPr>
               <w:t xml:space="preserve">Set once at group level</w:t>
             </w:r>
           </w:p>
@@ -2872,7 +3184,37 @@
                 <w:sz w:val="18"/>
                 <w:szCs w:val="18"/>
               </w:rPr>
-              <w:t xml:space="preserve">Per-child Image + Equation</w:t>
+              <w:t xml:space="preserve">Yes</w:t>
+            </w:r>
+          </w:p>
+        </w:tc>
+        <w:tc>
+          <w:tcPr>
+            <w:shd w:fill="f8f9ff" w:color="auto" w:val="clear"/>
+          </w:tcPr>
+          <w:p>
+            <w:r>
+              <w:rPr>
+                <w:color w:val="111827"/>
+                <w:sz w:val="18"/>
+                <w:szCs w:val="18"/>
+              </w:rPr>
+              <w:t xml:space="preserve">Per-child image fields</w:t>
+            </w:r>
+          </w:p>
+        </w:tc>
+        <w:tc>
+          <w:tcPr>
+            <w:shd w:fill="f8f9ff" w:color="auto" w:val="clear"/>
+          </w:tcPr>
+          <w:p>
+            <w:r>
+              <w:rPr>
+                <w:color w:val="111827"/>
+                <w:sz w:val="18"/>
+                <w:szCs w:val="18"/>
+              </w:rPr>
+              <w:t xml:space="preserve">Per-child equation fields</w:t>
             </w:r>
           </w:p>
         </w:tc>
@@ -2919,7 +3261,7 @@
                 <w:sz w:val="18"/>
                 <w:szCs w:val="18"/>
               </w:rPr>
-              <w:t xml:space="preserve">MANDATORY</w:t>
+              <w:t xml:space="preserve">MANDATORY per child</w:t>
             </w:r>
           </w:p>
         </w:tc>
@@ -2949,7 +3291,37 @@
                 <w:sz w:val="18"/>
                 <w:szCs w:val="18"/>
               </w:rPr>
-              <w:t xml:space="preserve">Per child — may differ across children</w:t>
+              <w:t xml:space="preserve">—</w:t>
+            </w:r>
+          </w:p>
+        </w:tc>
+        <w:tc>
+          <w:tcPr>
+            <w:shd w:fill="ffffff" w:color="auto" w:val="clear"/>
+          </w:tcPr>
+          <w:p>
+            <w:r>
+              <w:rPr>
+                <w:color w:val="111827"/>
+                <w:sz w:val="18"/>
+                <w:szCs w:val="18"/>
+              </w:rPr>
+              <w:t xml:space="preserve">—</w:t>
+            </w:r>
+          </w:p>
+        </w:tc>
+        <w:tc>
+          <w:tcPr>
+            <w:shd w:fill="ffffff" w:color="auto" w:val="clear"/>
+          </w:tcPr>
+          <w:p>
+            <w:r>
+              <w:rPr>
+                <w:color w:val="111827"/>
+                <w:sz w:val="18"/>
+                <w:szCs w:val="18"/>
+              </w:rPr>
+              <w:t xml:space="preserve">May differ across children</w:t>
             </w:r>
           </w:p>
         </w:tc>
@@ -2981,7 +3353,7 @@
                 <w:sz w:val="18"/>
                 <w:szCs w:val="18"/>
               </w:rPr>
-              <w:t xml:space="preserve">optional</w:t>
+              <w:t xml:space="preserve">optional per child</w:t>
             </w:r>
           </w:p>
         </w:tc>
@@ -3011,7 +3383,37 @@
                 <w:sz w:val="18"/>
                 <w:szCs w:val="18"/>
               </w:rPr>
-              <w:t xml:space="preserve">Per child — defaults to 0 if omitted</w:t>
+              <w:t xml:space="preserve">—</w:t>
+            </w:r>
+          </w:p>
+        </w:tc>
+        <w:tc>
+          <w:tcPr>
+            <w:shd w:fill="f8f9ff" w:color="auto" w:val="clear"/>
+          </w:tcPr>
+          <w:p>
+            <w:r>
+              <w:rPr>
+                <w:color w:val="111827"/>
+                <w:sz w:val="18"/>
+                <w:szCs w:val="18"/>
+              </w:rPr>
+              <w:t xml:space="preserve">—</w:t>
+            </w:r>
+          </w:p>
+        </w:tc>
+        <w:tc>
+          <w:tcPr>
+            <w:shd w:fill="f8f9ff" w:color="auto" w:val="clear"/>
+          </w:tcPr>
+          <w:p>
+            <w:r>
+              <w:rPr>
+                <w:color w:val="111827"/>
+                <w:sz w:val="18"/>
+                <w:szCs w:val="18"/>
+              </w:rPr>
+              <w:t xml:space="preserve">Defaults to 0 if omitted</w:t>
             </w:r>
           </w:p>
         </w:tc>
@@ -3044,6 +3446,36 @@
                 <w:szCs w:val="18"/>
               </w:rPr>
               <w:t xml:space="preserve">MANDATORY</w:t>
+            </w:r>
+          </w:p>
+        </w:tc>
+        <w:tc>
+          <w:tcPr>
+            <w:shd w:fill="ffffff" w:color="auto" w:val="clear"/>
+          </w:tcPr>
+          <w:p>
+            <w:r>
+              <w:rPr>
+                <w:color w:val="111827"/>
+                <w:sz w:val="18"/>
+                <w:szCs w:val="18"/>
+              </w:rPr>
+              <w:t xml:space="preserve">—</w:t>
+            </w:r>
+          </w:p>
+        </w:tc>
+        <w:tc>
+          <w:tcPr>
+            <w:shd w:fill="ffffff" w:color="auto" w:val="clear"/>
+          </w:tcPr>
+          <w:p>
+            <w:r>
+              <w:rPr>
+                <w:color w:val="111827"/>
+                <w:sz w:val="18"/>
+                <w:szCs w:val="18"/>
+              </w:rPr>
+              <w:t xml:space="preserve">—</w:t>
             </w:r>
           </w:p>
         </w:tc>

</xml_diff>